<commit_message>
Update resume PDF and Word downloads
</commit_message>
<xml_diff>
--- a/public/resume.docx
+++ b/public/resume.docx
@@ -2,18 +2,23 @@
 <file path=word/document.xml><?xml version="1.0" encoding="utf-8"?>
 <w:document xmlns:wpc="http://schemas.microsoft.com/office/word/2010/wordprocessingCanvas" xmlns:mo="http://schemas.microsoft.com/office/mac/office/2008/main" xmlns:mc="http://schemas.openxmlformats.org/markup-compatibility/2006" xmlns:mv="urn:schemas-microsoft-com:mac:vml" xmlns:o="urn:schemas-microsoft-com:office:office" xmlns:r="http://schemas.openxmlformats.org/officeDocument/2006/relationships" xmlns:m="http://schemas.openxmlformats.org/officeDocument/2006/math" xmlns:v="urn:schemas-microsoft-com:vml" xmlns:wp14="http://schemas.microsoft.com/office/word/2010/wordprocessingDrawing" xmlns:wp="http://schemas.openxmlformats.org/drawingml/2006/wordprocessingDrawing" xmlns:w10="urn:schemas-microsoft-com:office:word" xmlns:w="http://schemas.openxmlformats.org/wordprocessingml/2006/main" xmlns:w14="http://schemas.microsoft.com/office/word/2010/wordml" xmlns:wpg="http://schemas.microsoft.com/office/word/2010/wordprocessingGroup" xmlns:wpi="http://schemas.microsoft.com/office/word/2010/wordprocessingInk" xmlns:wne="http://schemas.microsoft.com/office/word/2006/wordml" xmlns:wps="http://schemas.microsoft.com/office/word/2010/wordprocessingShape" mc:Ignorable="w14 wp14">
   <w:body>
-    <w:p xmlns:wp14="http://schemas.microsoft.com/office/word/2010/wordml" wp14:textId="73814923">
+    <w:p>
       <w:pPr>
         <w:pStyle w:val="Title"/>
+        <w:spacing w:before="0" w:beforeAutospacing="off" w:after="0" w:afterAutospacing="off"/>
         <w:ind w:hanging="360"/>
         <w:jc w:val="left"/>
         <w:rPr>
           <w:rFonts w:ascii="Calibri" w:hAnsi="Calibri" w:eastAsia="Calibri" w:cs="Calibri" w:asciiTheme="majorAscii" w:hAnsiTheme="majorAscii" w:eastAsiaTheme="majorAscii" w:cstheme="majorAscii"/>
+          <w:sz w:val="40"/>
+          <w:szCs w:val="40"/>
         </w:rPr>
       </w:pPr>
       <w:r>
         <w:rPr>
           <w:rFonts w:ascii="Calibri" w:hAnsi="Calibri" w:eastAsia="Calibri" w:cs="Calibri" w:asciiTheme="majorAscii" w:hAnsiTheme="majorAscii" w:eastAsiaTheme="majorAscii" w:cstheme="majorAscii"/>
+          <w:sz w:val="40"/>
+          <w:szCs w:val="40"/>
         </w:rPr>
         <w:t>Alex Rother</w:t>
       </w:r>
@@ -21,7 +26,7 @@
     <w:p xmlns:wp14="http://schemas.microsoft.com/office/word/2010/wordml" wp14:textId="2175A41D">
       <w:pPr>
         <w:pStyle w:val="Normal"/>
-        <w:spacing w:after="40"/>
+        <w:spacing w:before="0" w:beforeAutospacing="off" w:after="60" w:afterAutospacing="off"/>
         <w:ind w:hanging="180"/>
         <w:jc w:val="left"/>
         <w:rPr>
@@ -30,7 +35,7 @@
           <w:szCs w:val="22"/>
         </w:rPr>
       </w:pPr>
-      <w:hyperlink r:id="Rf84907a76db34df3">
+      <w:hyperlink r:id="R8bafa953dccf4fcd">
         <w:r>
           <w:rPr>
             <w:rFonts w:ascii="Calibri" w:hAnsi="Calibri" w:eastAsia="Calibri" w:cs="Calibri" w:asciiTheme="majorAscii" w:hAnsiTheme="majorAscii" w:eastAsiaTheme="majorAscii" w:cstheme="majorAscii"/>
@@ -67,7 +72,7 @@
         </w:rPr>
         <w:t xml:space="preserve">  </w:t>
       </w:r>
-      <w:hyperlink r:id="R0a60ab40113f450c">
+      <w:hyperlink r:id="R448529c547ca4752">
         <w:r>
           <w:rPr>
             <w:rFonts w:ascii="Calibri" w:hAnsi="Calibri" w:eastAsia="Calibri" w:cs="Calibri" w:asciiTheme="majorAscii" w:hAnsiTheme="majorAscii" w:eastAsiaTheme="majorAscii" w:cstheme="majorAscii"/>
@@ -104,7 +109,7 @@
         </w:rPr>
         <w:t xml:space="preserve">  </w:t>
       </w:r>
-      <w:hyperlink r:id="Re92d4747561641ad">
+      <w:hyperlink r:id="R98d021eec96c426d">
         <w:r>
           <w:rPr>
             <w:rFonts w:ascii="Calibri" w:hAnsi="Calibri" w:eastAsia="Calibri" w:cs="Calibri" w:asciiTheme="majorAscii" w:hAnsiTheme="majorAscii" w:eastAsiaTheme="majorAscii" w:cstheme="majorAscii"/>
@@ -119,11 +124,8 @@
     <w:p>
       <w:pPr>
         <w:pStyle w:val="Normal"/>
-        <w:spacing w:before="120"/>
-        <w:ind w:left="-180" w:right="5220" w:firstLine="0"/>
-        <w:rPr>
-          <w:rFonts w:ascii="Calibri" w:hAnsi="Calibri" w:eastAsia="Calibri" w:cs="Calibri" w:asciiTheme="majorAscii" w:hAnsiTheme="majorAscii" w:eastAsiaTheme="majorAscii" w:cstheme="majorAscii"/>
-        </w:rPr>
+        <w:spacing w:before="0" w:beforeAutospacing="off" w:after="60" w:afterAutospacing="off"/>
+        <w:ind w:left="-180" w:right="990" w:firstLine="0"/>
       </w:pPr>
       <w:r>
         <w:rPr>
@@ -196,24 +198,48 @@
         <w:t>development.</w:t>
       </w:r>
     </w:p>
+    <w:p>
+      <w:pPr>
+        <w:pStyle w:val="Normal"/>
+        <w:spacing w:before="0" w:beforeAutospacing="off" w:after="60" w:afterAutospacing="off"/>
+        <w:ind w:left="-180" w:right="990" w:firstLine="0"/>
+        <w:rPr>
+          <w:rFonts w:ascii="Calibri" w:hAnsi="Calibri" w:eastAsia="Calibri" w:cs="Calibri" w:asciiTheme="majorAscii" w:hAnsiTheme="majorAscii" w:eastAsiaTheme="majorAscii" w:cstheme="majorAscii"/>
+        </w:rPr>
+      </w:pPr>
+    </w:p>
     <w:p xmlns:wp14="http://schemas.microsoft.com/office/word/2010/wordml" wp14:textId="77777777">
       <w:pPr>
         <w:pStyle w:val="Heading1"/>
-        <w:spacing w:after="0" w:afterAutospacing="off"/>
+        <w:spacing w:before="0" w:beforeAutospacing="off" w:after="100" w:afterAutospacing="off"/>
         <w:ind w:hanging="360"/>
         <w:rPr>
           <w:rFonts w:ascii="Calibri" w:hAnsi="Calibri" w:eastAsia="Calibri" w:cs="Calibri" w:asciiTheme="majorAscii" w:hAnsiTheme="majorAscii" w:eastAsiaTheme="majorAscii" w:cstheme="majorAscii"/>
-          <w:sz w:val="26"/>
-          <w:szCs w:val="26"/>
+          <w:b w:val="0"/>
+          <w:bCs w:val="0"/>
+          <w:sz w:val="22"/>
+          <w:szCs w:val="22"/>
         </w:rPr>
       </w:pPr>
       <w:r>
         <w:rPr>
           <w:rFonts w:ascii="Calibri" w:hAnsi="Calibri" w:eastAsia="Calibri" w:cs="Calibri" w:asciiTheme="majorAscii" w:hAnsiTheme="majorAscii" w:eastAsiaTheme="majorAscii" w:cstheme="majorAscii"/>
-          <w:sz w:val="26"/>
-          <w:szCs w:val="26"/>
+          <w:b w:val="0"/>
+          <w:bCs w:val="0"/>
+          <w:sz w:val="30"/>
+          <w:szCs w:val="30"/>
         </w:rPr>
-        <w:t>Education</w:t>
+        <w:t>E</w:t>
+      </w:r>
+      <w:r>
+        <w:rPr>
+          <w:rFonts w:ascii="Calibri" w:hAnsi="Calibri" w:eastAsia="Calibri" w:cs="Calibri" w:asciiTheme="majorAscii" w:hAnsiTheme="majorAscii" w:eastAsiaTheme="majorAscii" w:cstheme="majorAscii"/>
+          <w:b w:val="0"/>
+          <w:bCs w:val="0"/>
+          <w:sz w:val="24"/>
+          <w:szCs w:val="24"/>
+        </w:rPr>
+        <w:t>ducation</w:t>
       </w:r>
     </w:p>
     <w:p xmlns:wp14="http://schemas.microsoft.com/office/word/2010/wordml" wp14:textId="39F9CEA6">
@@ -292,15 +318,9 @@
         <w:tabs>
           <w:tab w:val="right" w:leader="none" w:pos="10368"/>
         </w:tabs>
-        <w:bidi w:val="0"/>
         <w:spacing w:before="0" w:beforeAutospacing="off" w:after="0" w:afterAutospacing="off" w:line="254" w:lineRule="auto"/>
         <w:ind w:left="0" w:right="0" w:hanging="180"/>
         <w:jc w:val="left"/>
-        <w:rPr>
-          <w:rFonts w:ascii="Calibri" w:hAnsi="Calibri" w:eastAsia="Calibri" w:cs="Calibri" w:asciiTheme="majorAscii" w:hAnsiTheme="majorAscii" w:eastAsiaTheme="majorAscii" w:cstheme="majorAscii"/>
-          <w:sz w:val="20"/>
-          <w:szCs w:val="20"/>
-        </w:rPr>
       </w:pPr>
       <w:r>
         <w:rPr>
@@ -337,12 +357,12 @@
     <w:p>
       <w:pPr>
         <w:pStyle w:val="Normal"/>
-        <w:spacing w:after="0" w:afterAutospacing="off"/>
+        <w:spacing w:before="0" w:beforeAutospacing="off" w:after="0" w:afterAutospacing="off"/>
         <w:ind w:left="0" w:hanging="180"/>
         <w:rPr>
           <w:rFonts w:ascii="Calibri" w:hAnsi="Calibri" w:eastAsia="Calibri" w:cs="Calibri" w:asciiTheme="majorAscii" w:hAnsiTheme="majorAscii" w:eastAsiaTheme="majorAscii" w:cstheme="majorAscii"/>
-          <w:sz w:val="19"/>
-          <w:szCs w:val="19"/>
+          <w:sz w:val="22"/>
+          <w:szCs w:val="22"/>
         </w:rPr>
       </w:pPr>
     </w:p>
@@ -351,22 +371,36 @@
         <w:pStyle w:val="Heading1"/>
         <w:suppressLineNumbers w:val="0"/>
         <w:bidi w:val="0"/>
-        <w:spacing w:before="220" w:beforeAutospacing="off" w:after="0" w:afterAutospacing="off" w:line="254" w:lineRule="auto"/>
+        <w:spacing w:before="0" w:beforeAutospacing="off" w:after="100" w:afterAutospacing="off" w:line="254" w:lineRule="auto"/>
         <w:ind w:left="0" w:right="0" w:hanging="360"/>
         <w:jc w:val="left"/>
         <w:rPr>
           <w:rFonts w:ascii="Calibri" w:hAnsi="Calibri" w:eastAsia="Calibri" w:cs="Calibri" w:asciiTheme="majorAscii" w:hAnsiTheme="majorAscii" w:eastAsiaTheme="majorAscii" w:cstheme="majorAscii"/>
-          <w:sz w:val="26"/>
-          <w:szCs w:val="26"/>
+          <w:b w:val="0"/>
+          <w:bCs w:val="0"/>
+          <w:sz w:val="22"/>
+          <w:szCs w:val="22"/>
         </w:rPr>
       </w:pPr>
       <w:r>
         <w:rPr>
           <w:rFonts w:ascii="Calibri" w:hAnsi="Calibri" w:eastAsia="Calibri" w:cs="Calibri" w:asciiTheme="majorAscii" w:hAnsiTheme="majorAscii" w:eastAsiaTheme="majorAscii" w:cstheme="majorAscii"/>
-          <w:sz w:val="26"/>
-          <w:szCs w:val="26"/>
+          <w:b w:val="0"/>
+          <w:bCs w:val="0"/>
+          <w:sz w:val="30"/>
+          <w:szCs w:val="30"/>
         </w:rPr>
-        <w:t>experience</w:t>
+        <w:t>e</w:t>
+      </w:r>
+      <w:r>
+        <w:rPr>
+          <w:rFonts w:ascii="Calibri" w:hAnsi="Calibri" w:eastAsia="Calibri" w:cs="Calibri" w:asciiTheme="majorAscii" w:hAnsiTheme="majorAscii" w:eastAsiaTheme="majorAscii" w:cstheme="majorAscii"/>
+          <w:b w:val="0"/>
+          <w:bCs w:val="0"/>
+          <w:sz w:val="24"/>
+          <w:szCs w:val="24"/>
+        </w:rPr>
+        <w:t>xperience</w:t>
       </w:r>
     </w:p>
     <w:p xmlns:wp14="http://schemas.microsoft.com/office/word/2010/wordml" wp14:textId="0F590967">
@@ -375,7 +409,7 @@
         <w:tabs>
           <w:tab w:val="right" w:pos="10368"/>
         </w:tabs>
-        <w:spacing w:before="60" w:after="0" w:afterAutospacing="off"/>
+        <w:spacing w:before="0" w:beforeAutospacing="off" w:after="0" w:afterAutospacing="off"/>
         <w:ind w:hanging="180"/>
         <w:rPr>
           <w:rFonts w:ascii="Calibri" w:hAnsi="Calibri" w:eastAsia="Calibri" w:cs="Calibri" w:asciiTheme="majorAscii" w:hAnsiTheme="majorAscii" w:eastAsiaTheme="majorAscii" w:cstheme="majorAscii"/>
@@ -439,8 +473,8 @@
     </w:p>
     <w:p xmlns:wp14="http://schemas.microsoft.com/office/word/2010/wordml" wp14:textId="262635C3">
       <w:pPr>
-        <w:keepNext/>
-        <w:spacing w:before="60" w:after="0" w:afterAutospacing="off"/>
+        <w:keepNext w:val="1"/>
+        <w:spacing w:before="0" w:beforeAutospacing="off" w:after="0" w:afterAutospacing="off"/>
         <w:ind w:hanging="180"/>
         <w:rPr>
           <w:rFonts w:ascii="Calibri" w:hAnsi="Calibri" w:eastAsia="Calibri" w:cs="Calibri" w:asciiTheme="majorAscii" w:hAnsiTheme="majorAscii" w:eastAsiaTheme="majorAscii" w:cstheme="majorAscii"/>
@@ -460,12 +494,12 @@
     <w:p xmlns:wp14="http://schemas.microsoft.com/office/word/2010/wordml" wp14:textId="68738264">
       <w:pPr>
         <w:pStyle w:val="ListParagraph"/>
-        <w:keepNext/>
+        <w:keepNext w:val="1"/>
         <w:numPr>
           <w:ilvl w:val="0"/>
           <w:numId w:val="20"/>
         </w:numPr>
-        <w:spacing w:before="60" w:after="0" w:afterAutospacing="off"/>
+        <w:spacing w:before="0" w:beforeAutospacing="off" w:after="0" w:afterAutospacing="off"/>
         <w:ind w:left="180" w:hanging="360"/>
         <w:rPr>
           <w:rFonts w:ascii="Calibri" w:hAnsi="Calibri" w:eastAsia="Calibri" w:cs="Calibri" w:asciiTheme="majorAscii" w:hAnsiTheme="majorAscii" w:eastAsiaTheme="majorAscii" w:cstheme="majorAscii"/>
@@ -543,12 +577,12 @@
     <w:p xmlns:wp14="http://schemas.microsoft.com/office/word/2010/wordml" wp14:textId="62A79034">
       <w:pPr>
         <w:pStyle w:val="ListParagraph"/>
-        <w:keepNext/>
+        <w:keepNext w:val="1"/>
         <w:numPr>
           <w:ilvl w:val="0"/>
           <w:numId w:val="20"/>
         </w:numPr>
-        <w:spacing w:before="60" w:after="0" w:afterAutospacing="off"/>
+        <w:spacing w:before="0" w:beforeAutospacing="off" w:after="0" w:afterAutospacing="off"/>
         <w:ind w:left="180" w:hanging="360"/>
         <w:rPr>
           <w:rFonts w:ascii="Calibri" w:hAnsi="Calibri" w:eastAsia="Calibri" w:cs="Calibri" w:asciiTheme="majorAscii" w:hAnsiTheme="majorAscii" w:eastAsiaTheme="majorAscii" w:cstheme="majorAscii"/>
@@ -610,9 +644,9 @@
     <w:p xmlns:wp14="http://schemas.microsoft.com/office/word/2010/wordml" wp14:textId="458DE532">
       <w:pPr>
         <w:pStyle w:val="ListParagraph"/>
-        <w:keepNext/>
-        <w:spacing w:before="60" w:after="0" w:afterAutospacing="off"/>
-        <w:ind w:left="180" w:hanging="360"/>
+        <w:keepNext w:val="1"/>
+        <w:spacing w:before="0" w:beforeAutospacing="off" w:after="0" w:afterAutospacing="off"/>
+        <w:ind w:left="-180" w:hanging="0"/>
         <w:rPr>
           <w:rFonts w:ascii="Calibri" w:hAnsi="Calibri" w:eastAsia="Calibri" w:cs="Calibri" w:asciiTheme="majorAscii" w:hAnsiTheme="majorAscii" w:eastAsiaTheme="majorAscii" w:cstheme="majorAscii"/>
           <w:sz w:val="22"/>
@@ -627,7 +661,7 @@
         <w:tabs>
           <w:tab w:val="right" w:pos="10368"/>
         </w:tabs>
-        <w:spacing w:before="60" w:after="0" w:afterAutospacing="off"/>
+        <w:spacing w:before="0" w:beforeAutospacing="off" w:after="0" w:afterAutospacing="off"/>
         <w:ind w:hanging="180"/>
         <w:rPr>
           <w:rFonts w:ascii="Calibri" w:hAnsi="Calibri" w:eastAsia="Calibri" w:cs="Calibri" w:asciiTheme="majorAscii" w:hAnsiTheme="majorAscii" w:eastAsiaTheme="majorAscii" w:cstheme="majorAscii"/>
@@ -691,7 +725,7 @@
     </w:p>
     <w:p>
       <w:pPr>
-        <w:spacing w:after="0" w:afterAutospacing="off"/>
+        <w:spacing w:before="0" w:beforeAutospacing="off" w:after="0" w:afterAutospacing="off"/>
         <w:ind w:hanging="180"/>
         <w:rPr>
           <w:rFonts w:ascii="Calibri" w:hAnsi="Calibri" w:eastAsia="Calibri" w:cs="Calibri" w:asciiTheme="majorAscii" w:hAnsiTheme="majorAscii" w:eastAsiaTheme="majorAscii" w:cstheme="majorAscii"/>
@@ -715,7 +749,7 @@
           <w:ilvl w:val="0"/>
           <w:numId w:val="19"/>
         </w:numPr>
-        <w:spacing w:after="0" w:afterAutospacing="off"/>
+        <w:spacing w:before="0" w:beforeAutospacing="off" w:after="0" w:afterAutospacing="off"/>
         <w:ind w:left="180" w:hanging="360"/>
         <w:rPr>
           <w:rFonts w:ascii="Calibri" w:hAnsi="Calibri" w:eastAsia="Calibri" w:cs="Calibri" w:asciiTheme="majorAscii" w:hAnsiTheme="majorAscii" w:eastAsiaTheme="majorAscii" w:cstheme="majorAscii"/>
@@ -894,20 +928,31 @@
         <w:spacing w:before="220" w:beforeAutospacing="off" w:after="100" w:afterAutospacing="off" w:line="254" w:lineRule="auto"/>
         <w:ind w:left="0" w:right="990" w:hanging="360"/>
         <w:jc w:val="left"/>
+        <w:rPr>
+          <w:rFonts w:ascii="Calibri" w:hAnsi="Calibri" w:eastAsia="Calibri" w:cs="Calibri" w:asciiTheme="majorAscii" w:hAnsiTheme="majorAscii" w:eastAsiaTheme="majorAscii" w:cstheme="majorAscii"/>
+          <w:b w:val="0"/>
+          <w:bCs w:val="0"/>
+          <w:sz w:val="24"/>
+          <w:szCs w:val="24"/>
+        </w:rPr>
       </w:pPr>
       <w:r>
         <w:rPr>
           <w:rFonts w:ascii="Calibri" w:hAnsi="Calibri" w:eastAsia="Calibri" w:cs="Calibri" w:asciiTheme="majorAscii" w:hAnsiTheme="majorAscii" w:eastAsiaTheme="majorAscii" w:cstheme="majorAscii"/>
-          <w:sz w:val="26"/>
-          <w:szCs w:val="26"/>
+          <w:b w:val="0"/>
+          <w:bCs w:val="0"/>
+          <w:sz w:val="30"/>
+          <w:szCs w:val="30"/>
         </w:rPr>
         <w:t>P</w:t>
       </w:r>
       <w:r>
         <w:rPr>
           <w:rFonts w:ascii="Calibri" w:hAnsi="Calibri" w:eastAsia="Calibri" w:cs="Calibri" w:asciiTheme="majorAscii" w:hAnsiTheme="majorAscii" w:eastAsiaTheme="majorAscii" w:cstheme="majorAscii"/>
-          <w:sz w:val="26"/>
-          <w:szCs w:val="26"/>
+          <w:b w:val="0"/>
+          <w:bCs w:val="0"/>
+          <w:sz w:val="24"/>
+          <w:szCs w:val="24"/>
         </w:rPr>
         <w:t>rojects</w:t>
       </w:r>
@@ -915,7 +960,7 @@
     <w:p>
       <w:pPr>
         <w:keepNext w:val="1"/>
-        <w:spacing w:before="120" w:after="0" w:afterAutospacing="off"/>
+        <w:spacing w:before="0" w:beforeAutospacing="off" w:after="0" w:afterAutospacing="off"/>
         <w:ind w:right="990" w:hanging="180"/>
         <w:rPr>
           <w:rFonts w:ascii="Calibri" w:hAnsi="Calibri" w:eastAsia="Calibri" w:cs="Calibri" w:asciiTheme="majorAscii" w:hAnsiTheme="majorAscii" w:eastAsiaTheme="majorAscii" w:cstheme="majorAscii"/>
@@ -939,7 +984,7 @@
     <w:p>
       <w:pPr>
         <w:keepNext w:val="1"/>
-        <w:spacing w:after="0" w:afterAutospacing="off"/>
+        <w:spacing w:before="0" w:beforeAutospacing="off" w:after="0" w:afterAutospacing="off"/>
         <w:ind w:right="990" w:hanging="180"/>
         <w:rPr>
           <w:rFonts w:ascii="Calibri" w:hAnsi="Calibri" w:eastAsia="Calibri" w:cs="Calibri" w:asciiTheme="majorAscii" w:hAnsiTheme="majorAscii" w:eastAsiaTheme="majorAscii" w:cstheme="majorAscii"/>
@@ -960,7 +1005,7 @@
       <w:pPr>
         <w:pStyle w:val="ListBullet"/>
         <w:keepLines w:val="1"/>
-        <w:spacing w:after="0" w:afterAutospacing="off"/>
+        <w:spacing w:before="0" w:beforeAutospacing="off" w:after="0" w:afterAutospacing="off"/>
         <w:ind w:left="180" w:right="990" w:hanging="360"/>
         <w:rPr>
           <w:rFonts w:ascii="Calibri" w:hAnsi="Calibri" w:eastAsia="Calibri" w:cs="Calibri" w:asciiTheme="majorAscii" w:hAnsiTheme="majorAscii" w:eastAsiaTheme="majorAscii" w:cstheme="majorAscii"/>
@@ -999,7 +1044,7 @@
       <w:pPr>
         <w:pStyle w:val="ListBullet"/>
         <w:keepLines w:val="1"/>
-        <w:spacing w:after="0" w:afterAutospacing="off"/>
+        <w:spacing w:before="0" w:beforeAutospacing="off" w:after="0" w:afterAutospacing="off"/>
         <w:ind w:left="180" w:right="990" w:hanging="360"/>
         <w:rPr>
           <w:rFonts w:ascii="Calibri" w:hAnsi="Calibri" w:eastAsia="Calibri" w:cs="Calibri" w:asciiTheme="majorAscii" w:hAnsiTheme="majorAscii" w:eastAsiaTheme="majorAscii" w:cstheme="majorAscii"/>
@@ -1056,7 +1101,7 @@
       <w:pPr>
         <w:pStyle w:val="ListBullet"/>
         <w:keepLines w:val="1"/>
-        <w:spacing w:after="0" w:afterAutospacing="off"/>
+        <w:spacing w:before="0" w:beforeAutospacing="off" w:after="0" w:afterAutospacing="off"/>
         <w:ind w:left="180" w:right="990" w:hanging="360"/>
         <w:rPr>
           <w:rFonts w:ascii="Calibri" w:hAnsi="Calibri" w:eastAsia="Calibri" w:cs="Calibri" w:asciiTheme="majorAscii" w:hAnsiTheme="majorAscii" w:eastAsiaTheme="majorAscii" w:cstheme="majorAscii"/>
@@ -1095,7 +1140,7 @@
       <w:pPr>
         <w:pStyle w:val="ListBullet"/>
         <w:keepLines w:val="1"/>
-        <w:spacing w:after="0" w:afterAutospacing="off"/>
+        <w:spacing w:before="0" w:beforeAutospacing="off" w:after="0" w:afterAutospacing="off"/>
         <w:ind w:left="180" w:right="990" w:hanging="360"/>
         <w:rPr>
           <w:rFonts w:ascii="Calibri" w:hAnsi="Calibri" w:eastAsia="Calibri" w:cs="Calibri" w:asciiTheme="majorAscii" w:hAnsiTheme="majorAscii" w:eastAsiaTheme="majorAscii" w:cstheme="majorAscii"/>
@@ -1138,7 +1183,7 @@
           <w:ilvl w:val="0"/>
           <w:numId w:val="0"/>
         </w:numPr>
-        <w:spacing w:after="0" w:afterAutospacing="off"/>
+        <w:spacing w:before="0" w:beforeAutospacing="off" w:after="0" w:afterAutospacing="off"/>
         <w:ind w:left="180" w:right="990" w:hanging="360"/>
         <w:rPr>
           <w:rFonts w:ascii="Calibri" w:hAnsi="Calibri" w:eastAsia="Calibri" w:cs="Calibri" w:asciiTheme="majorAscii" w:hAnsiTheme="majorAscii" w:eastAsiaTheme="majorAscii" w:cstheme="majorAscii"/>
@@ -1153,7 +1198,7 @@
         <w:keepNext w:val="1"/>
         <w:suppressLineNumbers w:val="0"/>
         <w:bidi w:val="0"/>
-        <w:spacing w:before="120" w:beforeAutospacing="off" w:after="0" w:afterAutospacing="off" w:line="254" w:lineRule="auto"/>
+        <w:spacing w:before="0" w:beforeAutospacing="off" w:after="0" w:afterAutospacing="off" w:line="254" w:lineRule="auto"/>
         <w:ind w:left="0" w:right="990" w:hanging="180"/>
         <w:jc w:val="left"/>
         <w:rPr>
@@ -1178,7 +1223,7 @@
     <w:p xmlns:wp14="http://schemas.microsoft.com/office/word/2010/wordml" wp14:textId="69F43B3F">
       <w:pPr>
         <w:keepNext w:val="1"/>
-        <w:spacing w:after="0" w:afterAutospacing="off"/>
+        <w:spacing w:before="0" w:beforeAutospacing="off" w:after="0" w:afterAutospacing="off"/>
         <w:ind w:right="990" w:hanging="180"/>
         <w:rPr>
           <w:rFonts w:ascii="Calibri" w:hAnsi="Calibri" w:eastAsia="Calibri" w:cs="Calibri" w:asciiTheme="majorAscii" w:hAnsiTheme="majorAscii" w:eastAsiaTheme="majorAscii" w:cstheme="majorAscii"/>
@@ -1247,7 +1292,7 @@
       <w:pPr>
         <w:pStyle w:val="ListBullet"/>
         <w:keepLines w:val="1"/>
-        <w:spacing w:after="0" w:afterAutospacing="off"/>
+        <w:spacing w:before="0" w:beforeAutospacing="off" w:after="0" w:afterAutospacing="off"/>
         <w:ind w:left="180" w:right="990" w:hanging="360"/>
         <w:rPr>
           <w:rFonts w:ascii="Calibri" w:hAnsi="Calibri" w:eastAsia="Calibri" w:cs="Calibri" w:asciiTheme="majorAscii" w:hAnsiTheme="majorAscii" w:eastAsiaTheme="majorAscii" w:cstheme="majorAscii"/>
@@ -1504,7 +1549,7 @@
       <w:pPr>
         <w:pStyle w:val="ListBullet"/>
         <w:keepLines w:val="1"/>
-        <w:spacing w:after="0" w:afterAutospacing="off"/>
+        <w:spacing w:before="0" w:beforeAutospacing="off" w:after="0" w:afterAutospacing="off"/>
         <w:ind w:left="180" w:right="990" w:hanging="360"/>
         <w:rPr>
           <w:rFonts w:ascii="Calibri" w:hAnsi="Calibri" w:eastAsia="Calibri" w:cs="Calibri" w:asciiTheme="majorAscii" w:hAnsiTheme="majorAscii" w:eastAsiaTheme="majorAscii" w:cstheme="majorAscii"/>
@@ -1717,7 +1762,7 @@
           <w:ilvl w:val="0"/>
           <w:numId w:val="0"/>
         </w:numPr>
-        <w:spacing w:after="0" w:afterAutospacing="off"/>
+        <w:spacing w:before="0" w:beforeAutospacing="off" w:after="0" w:afterAutospacing="off"/>
         <w:ind w:left="180" w:right="990" w:hanging="360"/>
         <w:rPr>
           <w:rFonts w:ascii="Calibri" w:hAnsi="Calibri" w:eastAsia="Calibri" w:cs="Calibri" w:asciiTheme="majorAscii" w:hAnsiTheme="majorAscii" w:eastAsiaTheme="majorAscii" w:cstheme="majorAscii"/>
@@ -1729,7 +1774,7 @@
     <w:p xmlns:wp14="http://schemas.microsoft.com/office/word/2010/wordml" wp14:textId="4954A4DA">
       <w:pPr>
         <w:keepNext w:val="1"/>
-        <w:spacing w:before="120" w:after="0" w:afterAutospacing="off"/>
+        <w:spacing w:before="0" w:beforeAutospacing="off" w:after="0" w:afterAutospacing="off"/>
         <w:ind w:right="990" w:hanging="180"/>
         <w:rPr>
           <w:rFonts w:ascii="Calibri" w:hAnsi="Calibri" w:eastAsia="Calibri" w:cs="Calibri" w:asciiTheme="majorAscii" w:hAnsiTheme="majorAscii" w:eastAsiaTheme="majorAscii" w:cstheme="majorAscii"/>
@@ -1754,7 +1799,7 @@
       <w:pPr>
         <w:pStyle w:val="Normal"/>
         <w:keepNext w:val="1"/>
-        <w:spacing w:after="0" w:afterAutospacing="off"/>
+        <w:spacing w:before="0" w:beforeAutospacing="off" w:after="0" w:afterAutospacing="off"/>
         <w:ind w:right="990" w:hanging="180"/>
         <w:rPr>
           <w:rFonts w:ascii="Calibri" w:hAnsi="Calibri" w:eastAsia="Calibri" w:cs="Calibri" w:asciiTheme="majorAscii" w:hAnsiTheme="majorAscii" w:eastAsiaTheme="majorAscii" w:cstheme="majorAscii"/>
@@ -1791,7 +1836,7 @@
       <w:pPr>
         <w:pStyle w:val="ListBullet"/>
         <w:keepLines w:val="1"/>
-        <w:spacing w:after="0" w:afterAutospacing="off"/>
+        <w:spacing w:before="0" w:beforeAutospacing="off" w:after="0" w:afterAutospacing="off"/>
         <w:ind w:left="180" w:right="990" w:hanging="360"/>
         <w:rPr>
           <w:rFonts w:ascii="Calibri" w:hAnsi="Calibri" w:eastAsia="Calibri" w:cs="Calibri" w:asciiTheme="majorAscii" w:hAnsiTheme="majorAscii" w:eastAsiaTheme="majorAscii" w:cstheme="majorAscii"/>
@@ -1892,7 +1937,7 @@
       <w:pPr>
         <w:pStyle w:val="ListBullet"/>
         <w:keepLines w:val="1"/>
-        <w:spacing w:after="0" w:afterAutospacing="off"/>
+        <w:spacing w:before="0" w:beforeAutospacing="off" w:after="0" w:afterAutospacing="off"/>
         <w:ind w:left="180" w:right="990" w:hanging="360"/>
         <w:rPr>
           <w:rFonts w:ascii="Calibri" w:hAnsi="Calibri" w:eastAsia="Calibri" w:cs="Calibri" w:asciiTheme="majorAscii" w:hAnsiTheme="majorAscii" w:eastAsiaTheme="majorAscii" w:cstheme="majorAscii"/>
@@ -1947,7 +1992,7 @@
       <w:pPr>
         <w:pStyle w:val="ListBullet"/>
         <w:keepLines w:val="1"/>
-        <w:spacing w:after="0" w:afterAutospacing="off"/>
+        <w:spacing w:before="0" w:beforeAutospacing="off" w:after="0" w:afterAutospacing="off"/>
         <w:ind w:left="180" w:right="990" w:hanging="360"/>
         <w:rPr>
           <w:rFonts w:ascii="Calibri" w:hAnsi="Calibri" w:eastAsia="Calibri" w:cs="Calibri" w:asciiTheme="majorAscii" w:hAnsiTheme="majorAscii" w:eastAsiaTheme="majorAscii" w:cstheme="majorAscii"/>
@@ -1990,11 +2035,11 @@
         <w:t xml:space="preserve"> verification Discord bot for my personal Discord server.</w:t>
       </w:r>
     </w:p>
-    <w:p xmlns:wp14="http://schemas.microsoft.com/office/word/2010/wordml" wp14:textId="0F0699DC">
+    <w:p xmlns:wp14="http://schemas.microsoft.com/office/word/2010/wordml" wp14:textId="3CA4A9D5">
       <w:pPr>
         <w:pStyle w:val="ListBullet"/>
         <w:keepLines w:val="1"/>
-        <w:spacing w:after="0" w:afterAutospacing="off"/>
+        <w:spacing w:before="0" w:beforeAutospacing="off" w:after="0" w:afterAutospacing="off"/>
         <w:ind w:left="180" w:right="990" w:hanging="360"/>
         <w:rPr>
           <w:rFonts w:ascii="Calibri" w:hAnsi="Calibri" w:eastAsia="Calibri" w:cs="Calibri" w:asciiTheme="majorAscii" w:hAnsiTheme="majorAscii" w:eastAsiaTheme="majorAscii" w:cstheme="majorAscii"/>
@@ -2031,7 +2076,7 @@
         <w:t>using React.</w:t>
       </w:r>
     </w:p>
-    <w:p xmlns:wp14="http://schemas.microsoft.com/office/word/2010/wordml" wp14:textId="7B8B428D">
+    <w:p>
       <w:pPr>
         <w:pStyle w:val="ListBullet"/>
         <w:keepLines w:val="1"/>
@@ -2039,8 +2084,8 @@
           <w:ilvl w:val="0"/>
           <w:numId w:val="0"/>
         </w:numPr>
-        <w:spacing w:after="0" w:afterAutospacing="off"/>
-        <w:ind w:left="180" w:right="990" w:hanging="360"/>
+        <w:spacing w:before="0" w:beforeAutospacing="off" w:after="0" w:afterAutospacing="off"/>
+        <w:ind w:right="990"/>
         <w:rPr>
           <w:rFonts w:ascii="Calibri" w:hAnsi="Calibri" w:eastAsia="Calibri" w:cs="Calibri" w:asciiTheme="majorAscii" w:hAnsiTheme="majorAscii" w:eastAsiaTheme="majorAscii" w:cstheme="majorAscii"/>
           <w:sz w:val="22"/>
@@ -2048,98 +2093,144 @@
         </w:rPr>
       </w:pPr>
     </w:p>
-    <w:p xmlns:wp14="http://schemas.microsoft.com/office/word/2010/wordml" wp14:textId="150C958C">
-      <w:pPr>
-        <w:keepNext w:val="1"/>
-        <w:spacing w:before="0" w:beforeAutospacing="off" w:after="0" w:afterAutospacing="off"/>
-        <w:ind w:right="990" w:hanging="180"/>
+    <w:p>
+      <w:pPr>
+        <w:pStyle w:val="Heading1"/>
+        <w:suppressLineNumbers w:val="0"/>
+        <w:bidi w:val="0"/>
+        <w:spacing w:before="220" w:beforeAutospacing="off" w:after="100" w:afterAutospacing="off" w:line="254" w:lineRule="auto"/>
+        <w:ind w:left="0" w:right="990" w:hanging="360"/>
+        <w:jc w:val="left"/>
         <w:rPr>
           <w:rFonts w:ascii="Calibri" w:hAnsi="Calibri" w:eastAsia="Calibri" w:cs="Calibri" w:asciiTheme="majorAscii" w:hAnsiTheme="majorAscii" w:eastAsiaTheme="majorAscii" w:cstheme="majorAscii"/>
-          <w:b w:val="1"/>
-          <w:bCs w:val="1"/>
-          <w:sz w:val="24"/>
-          <w:szCs w:val="24"/>
+          <w:b w:val="0"/>
+          <w:bCs w:val="0"/>
+          <w:sz w:val="22"/>
+          <w:szCs w:val="22"/>
         </w:rPr>
       </w:pPr>
       <w:r>
         <w:rPr>
           <w:rFonts w:ascii="Calibri" w:hAnsi="Calibri" w:eastAsia="Calibri" w:cs="Calibri" w:asciiTheme="majorAscii" w:hAnsiTheme="majorAscii" w:eastAsiaTheme="majorAscii" w:cstheme="majorAscii"/>
-          <w:b w:val="1"/>
-          <w:bCs w:val="1"/>
-          <w:sz w:val="24"/>
-          <w:szCs w:val="24"/>
+          <w:b w:val="0"/>
+          <w:bCs w:val="0"/>
+          <w:sz w:val="30"/>
+          <w:szCs w:val="30"/>
         </w:rPr>
-        <w:t>Programming Languages</w:t>
-      </w:r>
-    </w:p>
-    <w:p xmlns:wp14="http://schemas.microsoft.com/office/word/2010/wordml" wp14:textId="412C2C28">
-      <w:pPr>
-        <w:pStyle w:val="ListParagraph"/>
-        <w:keepNext w:val="1"/>
-        <w:numPr>
-          <w:ilvl w:val="0"/>
-          <w:numId w:val="22"/>
-        </w:numPr>
-        <w:spacing w:before="0" w:beforeAutospacing="off" w:after="0" w:afterAutospacing="off"/>
-        <w:ind w:left="180" w:right="990" w:hanging="360"/>
-        <w:rPr>
-          <w:rFonts w:ascii="Calibri" w:hAnsi="Calibri" w:eastAsia="Calibri" w:cs="Calibri" w:asciiTheme="majorAscii" w:hAnsiTheme="majorAscii" w:eastAsiaTheme="majorAscii" w:cstheme="majorAscii"/>
-          <w:sz w:val="22"/>
-          <w:szCs w:val="22"/>
-          <w:lang w:val="en-US"/>
-        </w:rPr>
-      </w:pPr>
-      <w:r>
-        <w:rPr>
-          <w:rFonts w:ascii="Calibri" w:hAnsi="Calibri" w:eastAsia="Calibri" w:cs="Calibri" w:asciiTheme="majorAscii" w:hAnsiTheme="majorAscii" w:eastAsiaTheme="majorAscii" w:cstheme="majorAscii"/>
-          <w:sz w:val="22"/>
-          <w:szCs w:val="22"/>
-          <w:lang w:val="en-US"/>
-        </w:rPr>
-        <w:t xml:space="preserve">C++, C#, </w:t>
+        <w:t>L</w:t>
       </w:r>
       <w:r>
         <w:rPr>
           <w:rFonts w:ascii="Calibri" w:hAnsi="Calibri" w:eastAsia="Calibri" w:cs="Calibri" w:asciiTheme="majorAscii" w:hAnsiTheme="majorAscii" w:eastAsiaTheme="majorAscii" w:cstheme="majorAscii"/>
-          <w:sz w:val="22"/>
-          <w:szCs w:val="22"/>
-          <w:lang w:val="en-US"/>
+          <w:b w:val="0"/>
+          <w:bCs w:val="0"/>
+          <w:sz w:val="24"/>
+          <w:szCs w:val="24"/>
         </w:rPr>
-        <w:t xml:space="preserve">Rust, Python, </w:t>
+        <w:t>anguages</w:t>
+      </w:r>
+    </w:p>
+    <w:p>
+      <w:pPr>
+        <w:pStyle w:val="ListBullet"/>
+        <w:keepLines w:val="1"/>
+        <w:spacing w:before="0" w:beforeAutospacing="off" w:after="0" w:afterAutospacing="off"/>
+        <w:ind w:left="180" w:right="990" w:hanging="360"/>
+        <w:rPr>
+          <w:rFonts w:ascii="Calibri" w:hAnsi="Calibri" w:eastAsia="Calibri" w:cs="Calibri"/>
+          <w:b w:val="0"/>
+          <w:bCs w:val="0"/>
+          <w:sz w:val="24"/>
+          <w:szCs w:val="24"/>
+        </w:rPr>
+      </w:pPr>
+      <w:r>
+        <w:rPr>
+          <w:rFonts w:ascii="Calibri" w:hAnsi="Calibri" w:eastAsia="Calibri" w:cs="Calibri"/>
+          <w:b w:val="0"/>
+          <w:bCs w:val="0"/>
+          <w:sz w:val="24"/>
+          <w:szCs w:val="24"/>
+        </w:rPr>
+        <w:t xml:space="preserve">C++, C, </w:t>
       </w:r>
       <w:r>
         <w:rPr>
-          <w:rFonts w:ascii="Calibri" w:hAnsi="Calibri" w:eastAsia="Calibri" w:cs="Calibri" w:asciiTheme="majorAscii" w:hAnsiTheme="majorAscii" w:eastAsiaTheme="majorAscii" w:cstheme="majorAscii"/>
-          <w:sz w:val="22"/>
-          <w:szCs w:val="22"/>
-          <w:lang w:val="en-US"/>
+          <w:rFonts w:ascii="Calibri" w:hAnsi="Calibri" w:eastAsia="Calibri" w:cs="Calibri"/>
+          <w:b w:val="0"/>
+          <w:bCs w:val="0"/>
+          <w:sz w:val="24"/>
+          <w:szCs w:val="24"/>
         </w:rPr>
-        <w:t xml:space="preserve">Java, Golang, </w:t>
+        <w:t xml:space="preserve">C#, </w:t>
       </w:r>
       <w:r>
         <w:rPr>
-          <w:rFonts w:ascii="Calibri" w:hAnsi="Calibri" w:eastAsia="Calibri" w:cs="Calibri" w:asciiTheme="majorAscii" w:hAnsiTheme="majorAscii" w:eastAsiaTheme="majorAscii" w:cstheme="majorAscii"/>
-          <w:sz w:val="22"/>
-          <w:szCs w:val="22"/>
-          <w:lang w:val="en-US"/>
+          <w:rFonts w:ascii="Calibri" w:hAnsi="Calibri" w:eastAsia="Calibri" w:cs="Calibri"/>
+          <w:b w:val="0"/>
+          <w:bCs w:val="0"/>
+          <w:sz w:val="24"/>
+          <w:szCs w:val="24"/>
+        </w:rPr>
+        <w:t xml:space="preserve">Python, </w:t>
+      </w:r>
+      <w:r>
+        <w:rPr>
+          <w:rFonts w:ascii="Calibri" w:hAnsi="Calibri" w:eastAsia="Calibri" w:cs="Calibri"/>
+          <w:b w:val="0"/>
+          <w:bCs w:val="0"/>
+          <w:sz w:val="24"/>
+          <w:szCs w:val="24"/>
+        </w:rPr>
+        <w:t xml:space="preserve">Rust, Golang, Java, </w:t>
+      </w:r>
+      <w:r>
+        <w:rPr>
+          <w:rFonts w:ascii="Calibri" w:hAnsi="Calibri" w:eastAsia="Calibri" w:cs="Calibri"/>
+          <w:b w:val="0"/>
+          <w:bCs w:val="0"/>
+          <w:sz w:val="24"/>
+          <w:szCs w:val="24"/>
         </w:rPr>
         <w:t>Type</w:t>
       </w:r>
       <w:r>
         <w:rPr>
-          <w:rFonts w:ascii="Calibri" w:hAnsi="Calibri" w:eastAsia="Calibri" w:cs="Calibri" w:asciiTheme="majorAscii" w:hAnsiTheme="majorAscii" w:eastAsiaTheme="majorAscii" w:cstheme="majorAscii"/>
-          <w:sz w:val="22"/>
-          <w:szCs w:val="22"/>
-          <w:lang w:val="en-US"/>
+          <w:rFonts w:ascii="Calibri" w:hAnsi="Calibri" w:eastAsia="Calibri" w:cs="Calibri"/>
+          <w:b w:val="0"/>
+          <w:bCs w:val="0"/>
+          <w:sz w:val="24"/>
+          <w:szCs w:val="24"/>
         </w:rPr>
         <w:t>S</w:t>
       </w:r>
       <w:r>
         <w:rPr>
-          <w:rFonts w:ascii="Calibri" w:hAnsi="Calibri" w:eastAsia="Calibri" w:cs="Calibri" w:asciiTheme="majorAscii" w:hAnsiTheme="majorAscii" w:eastAsiaTheme="majorAscii" w:cstheme="majorAscii"/>
-          <w:sz w:val="22"/>
-          <w:szCs w:val="22"/>
-          <w:lang w:val="en-US"/>
+          <w:rFonts w:ascii="Calibri" w:hAnsi="Calibri" w:eastAsia="Calibri" w:cs="Calibri"/>
+          <w:b w:val="0"/>
+          <w:bCs w:val="0"/>
+          <w:sz w:val="24"/>
+          <w:szCs w:val="24"/>
+        </w:rPr>
+        <w:t>cript, Java</w:t>
+      </w:r>
+      <w:r>
+        <w:rPr>
+          <w:rFonts w:ascii="Calibri" w:hAnsi="Calibri" w:eastAsia="Calibri" w:cs="Calibri"/>
+          <w:b w:val="0"/>
+          <w:bCs w:val="0"/>
+          <w:sz w:val="24"/>
+          <w:szCs w:val="24"/>
+        </w:rPr>
+        <w:t>S</w:t>
+      </w:r>
+      <w:r>
+        <w:rPr>
+          <w:rFonts w:ascii="Calibri" w:hAnsi="Calibri" w:eastAsia="Calibri" w:cs="Calibri"/>
+          <w:b w:val="0"/>
+          <w:bCs w:val="0"/>
+          <w:sz w:val="24"/>
+          <w:szCs w:val="24"/>
         </w:rPr>
         <w:t>cript</w:t>
       </w:r>
@@ -2191,6 +2282,118 @@
 
 <file path=word/numbering.xml><?xml version="1.0" encoding="utf-8"?>
 <w:numbering xmlns:wpc="http://schemas.microsoft.com/office/word/2010/wordprocessingCanvas" xmlns:mo="http://schemas.microsoft.com/office/mac/office/2008/main" xmlns:mc="http://schemas.openxmlformats.org/markup-compatibility/2006" xmlns:mv="urn:schemas-microsoft-com:mac:vml" xmlns:o="urn:schemas-microsoft-com:office:office" xmlns:r="http://schemas.openxmlformats.org/officeDocument/2006/relationships" xmlns:m="http://schemas.openxmlformats.org/officeDocument/2006/math" xmlns:v="urn:schemas-microsoft-com:vml" xmlns:wp14="http://schemas.microsoft.com/office/word/2010/wordprocessingDrawing" xmlns:wp="http://schemas.openxmlformats.org/drawingml/2006/wordprocessingDrawing" xmlns:w10="urn:schemas-microsoft-com:office:word" xmlns:w="http://schemas.openxmlformats.org/wordprocessingml/2006/main" xmlns:w14="http://schemas.microsoft.com/office/word/2010/wordml" xmlns:wpg="http://schemas.microsoft.com/office/word/2010/wordprocessingGroup" xmlns:wpi="http://schemas.microsoft.com/office/word/2010/wordprocessingInk" xmlns:wne="http://schemas.microsoft.com/office/word/2006/wordml" xmlns:wps="http://schemas.microsoft.com/office/word/2010/wordprocessingShape" mc:Ignorable="w14 wp14">
+  <w:abstractNum xmlns:w="http://schemas.openxmlformats.org/wordprocessingml/2006/main" w:abstractNumId="22">
+    <w:nsid w:val="13db756d"/>
+    <w:multiLevelType xmlns:w="http://schemas.openxmlformats.org/wordprocessingml/2006/main" w:val="hybridMultilevel"/>
+    <w:lvl xmlns:w="http://schemas.openxmlformats.org/wordprocessingml/2006/main" w:ilvl="0">
+      <w:start w:val="1"/>
+      <w:numFmt w:val="bullet"/>
+      <w:lvlText w:val=""/>
+      <w:lvlJc w:val="left"/>
+      <w:pPr>
+        <w:ind w:left="360" w:hanging="360"/>
+      </w:pPr>
+      <w:rPr>
+        <w:rFonts w:hint="default" w:ascii="Symbol" w:hAnsi="Symbol"/>
+      </w:rPr>
+    </w:lvl>
+    <w:lvl xmlns:w="http://schemas.openxmlformats.org/wordprocessingml/2006/main" w:ilvl="1">
+      <w:start w:val="1"/>
+      <w:numFmt w:val="bullet"/>
+      <w:lvlText w:val="o"/>
+      <w:lvlJc w:val="left"/>
+      <w:pPr>
+        <w:ind w:left="1080" w:hanging="360"/>
+      </w:pPr>
+      <w:rPr>
+        <w:rFonts w:hint="default" w:ascii="Courier New" w:hAnsi="Courier New"/>
+      </w:rPr>
+    </w:lvl>
+    <w:lvl xmlns:w="http://schemas.openxmlformats.org/wordprocessingml/2006/main" w:ilvl="2">
+      <w:start w:val="1"/>
+      <w:numFmt w:val="bullet"/>
+      <w:lvlText w:val=""/>
+      <w:lvlJc w:val="left"/>
+      <w:pPr>
+        <w:ind w:left="1800" w:hanging="360"/>
+      </w:pPr>
+      <w:rPr>
+        <w:rFonts w:hint="default" w:ascii="Wingdings" w:hAnsi="Wingdings"/>
+      </w:rPr>
+    </w:lvl>
+    <w:lvl xmlns:w="http://schemas.openxmlformats.org/wordprocessingml/2006/main" w:ilvl="3">
+      <w:start w:val="1"/>
+      <w:numFmt w:val="bullet"/>
+      <w:lvlText w:val=""/>
+      <w:lvlJc w:val="left"/>
+      <w:pPr>
+        <w:ind w:left="2520" w:hanging="360"/>
+      </w:pPr>
+      <w:rPr>
+        <w:rFonts w:hint="default" w:ascii="Symbol" w:hAnsi="Symbol"/>
+      </w:rPr>
+    </w:lvl>
+    <w:lvl xmlns:w="http://schemas.openxmlformats.org/wordprocessingml/2006/main" w:ilvl="4">
+      <w:start w:val="1"/>
+      <w:numFmt w:val="bullet"/>
+      <w:lvlText w:val="o"/>
+      <w:lvlJc w:val="left"/>
+      <w:pPr>
+        <w:ind w:left="3240" w:hanging="360"/>
+      </w:pPr>
+      <w:rPr>
+        <w:rFonts w:hint="default" w:ascii="Courier New" w:hAnsi="Courier New"/>
+      </w:rPr>
+    </w:lvl>
+    <w:lvl xmlns:w="http://schemas.openxmlformats.org/wordprocessingml/2006/main" w:ilvl="5">
+      <w:start w:val="1"/>
+      <w:numFmt w:val="bullet"/>
+      <w:lvlText w:val=""/>
+      <w:lvlJc w:val="left"/>
+      <w:pPr>
+        <w:ind w:left="3960" w:hanging="360"/>
+      </w:pPr>
+      <w:rPr>
+        <w:rFonts w:hint="default" w:ascii="Wingdings" w:hAnsi="Wingdings"/>
+      </w:rPr>
+    </w:lvl>
+    <w:lvl xmlns:w="http://schemas.openxmlformats.org/wordprocessingml/2006/main" w:ilvl="6">
+      <w:start w:val="1"/>
+      <w:numFmt w:val="bullet"/>
+      <w:lvlText w:val=""/>
+      <w:lvlJc w:val="left"/>
+      <w:pPr>
+        <w:ind w:left="4680" w:hanging="360"/>
+      </w:pPr>
+      <w:rPr>
+        <w:rFonts w:hint="default" w:ascii="Symbol" w:hAnsi="Symbol"/>
+      </w:rPr>
+    </w:lvl>
+    <w:lvl xmlns:w="http://schemas.openxmlformats.org/wordprocessingml/2006/main" w:ilvl="7">
+      <w:start w:val="1"/>
+      <w:numFmt w:val="bullet"/>
+      <w:lvlText w:val="o"/>
+      <w:lvlJc w:val="left"/>
+      <w:pPr>
+        <w:ind w:left="5400" w:hanging="360"/>
+      </w:pPr>
+      <w:rPr>
+        <w:rFonts w:hint="default" w:ascii="Courier New" w:hAnsi="Courier New"/>
+      </w:rPr>
+    </w:lvl>
+    <w:lvl xmlns:w="http://schemas.openxmlformats.org/wordprocessingml/2006/main" w:ilvl="8">
+      <w:start w:val="1"/>
+      <w:numFmt w:val="bullet"/>
+      <w:lvlText w:val=""/>
+      <w:lvlJc w:val="left"/>
+      <w:pPr>
+        <w:ind w:left="6120" w:hanging="360"/>
+      </w:pPr>
+      <w:rPr>
+        <w:rFonts w:hint="default" w:ascii="Wingdings" w:hAnsi="Wingdings"/>
+      </w:rPr>
+    </w:lvl>
+  </w:abstractNum>
   <w:abstractNum xmlns:w="http://schemas.openxmlformats.org/wordprocessingml/2006/main" w:abstractNumId="21">
     <w:nsid w:val="7deb735b"/>
     <w:multiLevelType xmlns:w="http://schemas.openxmlformats.org/wordprocessingml/2006/main" w:val="hybridMultilevel"/>
@@ -3818,6 +4021,9 @@
       </w:rPr>
     </w:lvl>
   </w:abstractNum>
+  <w:num w:numId="23">
+    <w:abstractNumId w:val="22"/>
+  </w:num>
   <w:num w:numId="22">
     <w:abstractNumId w:val="21"/>
   </w:num>

</xml_diff>